<commit_message>
Define launch packages, usage limits and document presets
</commit_message>
<xml_diff>
--- a/documents/generated/brief.docx
+++ b/documents/generated/brief.docx
@@ -12,7 +12,7 @@
     </w:p>
     <w:p>
       <w:r>
-        <w:t>Projekt do uzgodnienia • wersja 1.0</w:t>
+        <w:t>Projekt do uzgodnienia • wersja 1.1</w:t>
       </w:r>
     </w:p>
     <w:p>
@@ -117,7 +117,7 @@
       <w:pStyle w:val="Footer"/>
     </w:pPr>
     <w:r>
-      <w:t xml:space="preserve">WZÓR B2B • PROJEKT DO UZGODNIENIA • WERSJA 1.0  |  </w:t>
+      <w:t xml:space="preserve">WZÓR B2B • PROJEKT DO UZGODNIENIA • WERSJA 1.1  |  </w:t>
     </w:r>
     <w:fldSimple w:instr="PAGE"/>
   </w:p>

</xml_diff>

<commit_message>
Expand scoped service offers and add an interactive client panel demo
</commit_message>
<xml_diff>
--- a/documents/generated/brief.docx
+++ b/documents/generated/brief.docx
@@ -12,7 +12,7 @@
     </w:p>
     <w:p>
       <w:r>
-        <w:t>Projekt do uzgodnienia • wersja 1.1</w:t>
+        <w:t>Projekt do uzgodnienia • wersja 1.2</w:t>
       </w:r>
     </w:p>
     <w:p>
@@ -117,7 +117,7 @@
       <w:pStyle w:val="Footer"/>
     </w:pPr>
     <w:r>
-      <w:t xml:space="preserve">WZÓR B2B • PROJEKT DO UZGODNIENIA • WERSJA 1.1  |  </w:t>
+      <w:t xml:space="preserve">WZÓR B2B • PROJEKT DO UZGODNIENIA • WERSJA 1.2  |  </w:t>
     </w:r>
     <w:fldSimple w:instr="PAGE"/>
   </w:p>

</xml_diff>